<commit_message>
Cap nhat toan dien Bao cao do an (Word & Markdown): Bo sung chuc nang TKB da chieu, doi lich 2 cap, CTDT 130 tin chi, phan trang, audit log, RBAC 6 vai tro va bo suu tap 19 anh giao dien thuc te
</commit_message>
<xml_diff>
--- a/BTL_CN_Java.docx
+++ b/BTL_CN_Java.docx
@@ -2784,7 +2784,7 @@
         </w:rPr>
       </w:pPr>
       <w:r>
-        <w:t>Hình 2.1 Biểu đồ phân cấp chức năng hệ thống [Thiết kế trên Draw.io]</w:t>
+        <w:t>Hình 2.1 Biểu đồ phân cấp chức năng hệ thống (BFD) [Thiết kế trên Draw.io]</w:t>
         <w:tab/>
         <w:t>7</w:t>
       </w:r>
@@ -2825,63 +2825,11 @@
           <w14:ligatures w14:val="standardContextual"/>
         </w:rPr>
       </w:pPr>
-      <w:hyperlink w:anchor="_Toc239517678" w:history="1">
-        <w:r>
-          <w:rPr>
-            <w:rStyle w:val="Hyperlink"/>
-            <w:noProof/>
-          </w:rPr>
-          <w:t>Hình 2.3 Mô hình liên kết thực thể</w:t>
-        </w:r>
-        <w:r>
-          <w:rPr>
-            <w:noProof/>
-            <w:webHidden/>
-          </w:rPr>
-          <w:tab/>
-        </w:r>
-        <w:r>
-          <w:rPr>
-            <w:noProof/>
-            <w:webHidden/>
-          </w:rPr>
-          <w:fldChar w:fldCharType="begin"/>
-        </w:r>
-        <w:r>
-          <w:rPr>
-            <w:noProof/>
-            <w:webHidden/>
-          </w:rPr>
-          <w:instrText xml:space="preserve"> PAGEREF _Toc239517678 \h </w:instrText>
-        </w:r>
-        <w:r>
-          <w:rPr>
-            <w:noProof/>
-            <w:webHidden/>
-          </w:rPr>
-        </w:r>
-        <w:r>
-          <w:rPr>
-            <w:noProof/>
-            <w:webHidden/>
-          </w:rPr>
-          <w:fldChar w:fldCharType="separate"/>
-        </w:r>
-        <w:r>
-          <w:rPr>
-            <w:noProof/>
-            <w:webHidden/>
-          </w:rPr>
-          <w:t>16</w:t>
-        </w:r>
-        <w:r>
-          <w:rPr>
-            <w:noProof/>
-            <w:webHidden/>
-          </w:rPr>
-          <w:fldChar w:fldCharType="end"/>
-        </w:r>
-      </w:hyperlink>
+      <w:r>
+        <w:t>Hình 2.3 Mô hình liên kết thực thể (ERD)</w:t>
+        <w:tab/>
+        <w:t>16</w:t>
+      </w:r>
     </w:p>
     <w:p>
       <w:pPr>
@@ -2898,63 +2846,11 @@
           <w14:ligatures w14:val="standardContextual"/>
         </w:rPr>
       </w:pPr>
-      <w:hyperlink w:anchor="_Toc239517679" w:history="1">
-        <w:r>
-          <w:rPr>
-            <w:rStyle w:val="Hyperlink"/>
-            <w:noProof/>
-          </w:rPr>
-          <w:t>Hình 2.4 Mô hình vật lý csdl</w:t>
-        </w:r>
-        <w:r>
-          <w:rPr>
-            <w:noProof/>
-            <w:webHidden/>
-          </w:rPr>
-          <w:tab/>
-        </w:r>
-        <w:r>
-          <w:rPr>
-            <w:noProof/>
-            <w:webHidden/>
-          </w:rPr>
-          <w:fldChar w:fldCharType="begin"/>
-        </w:r>
-        <w:r>
-          <w:rPr>
-            <w:noProof/>
-            <w:webHidden/>
-          </w:rPr>
-          <w:instrText xml:space="preserve"> PAGEREF _Toc239517679 \h </w:instrText>
-        </w:r>
-        <w:r>
-          <w:rPr>
-            <w:noProof/>
-            <w:webHidden/>
-          </w:rPr>
-        </w:r>
-        <w:r>
-          <w:rPr>
-            <w:noProof/>
-            <w:webHidden/>
-          </w:rPr>
-          <w:fldChar w:fldCharType="separate"/>
-        </w:r>
-        <w:r>
-          <w:rPr>
-            <w:noProof/>
-            <w:webHidden/>
-          </w:rPr>
-          <w:t>17</w:t>
-        </w:r>
-        <w:r>
-          <w:rPr>
-            <w:noProof/>
-            <w:webHidden/>
-          </w:rPr>
-          <w:fldChar w:fldCharType="end"/>
-        </w:r>
-      </w:hyperlink>
+      <w:r>
+        <w:t>Hình 2.4 Mô hình vật lý cơ sở dữ liệu (Physical Data Model)</w:t>
+        <w:tab/>
+        <w:t>17</w:t>
+      </w:r>
     </w:p>
     <w:p>
       <w:pPr>
@@ -2971,64 +2867,11 @@
           <w14:ligatures w14:val="standardContextual"/>
         </w:rPr>
       </w:pPr>
-      <w:hyperlink w:anchor="_Toc239517680" w:history="1">
-        <w:r>
-          <w:rPr>
-            <w:rStyle w:val="Hyperlink"/>
-            <w:noProof/>
-            <w:lang w:val="vi-VN"/>
-          </w:rPr>
-          <w:t>Hình 3.1: Giao diện Đăng nhập hệ thống (LoginForm)</w:t>
-        </w:r>
-        <w:r>
-          <w:rPr>
-            <w:noProof/>
-            <w:webHidden/>
-          </w:rPr>
-          <w:tab/>
-        </w:r>
-        <w:r>
-          <w:rPr>
-            <w:noProof/>
-            <w:webHidden/>
-          </w:rPr>
-          <w:fldChar w:fldCharType="begin"/>
-        </w:r>
-        <w:r>
-          <w:rPr>
-            <w:noProof/>
-            <w:webHidden/>
-          </w:rPr>
-          <w:instrText xml:space="preserve"> PAGEREF _Toc239517680 \h </w:instrText>
-        </w:r>
-        <w:r>
-          <w:rPr>
-            <w:noProof/>
-            <w:webHidden/>
-          </w:rPr>
-        </w:r>
-        <w:r>
-          <w:rPr>
-            <w:noProof/>
-            <w:webHidden/>
-          </w:rPr>
-          <w:fldChar w:fldCharType="separate"/>
-        </w:r>
-        <w:r>
-          <w:rPr>
-            <w:noProof/>
-            <w:webHidden/>
-          </w:rPr>
-          <w:t>31</w:t>
-        </w:r>
-        <w:r>
-          <w:rPr>
-            <w:noProof/>
-            <w:webHidden/>
-          </w:rPr>
-          <w:fldChar w:fldCharType="end"/>
-        </w:r>
-      </w:hyperlink>
+      <w:r>
+        <w:t>Hình 3.1: Giao diện Đăng nhập hệ thống &amp; Quick Login 6 vai trò (LoginForm)</w:t>
+        <w:tab/>
+        <w:t>31</w:t>
+      </w:r>
     </w:p>
     <w:p>
       <w:pPr>
@@ -3045,64 +2888,11 @@
           <w14:ligatures w14:val="standardContextual"/>
         </w:rPr>
       </w:pPr>
-      <w:hyperlink w:anchor="_Toc239517681" w:history="1">
-        <w:r>
-          <w:rPr>
-            <w:rStyle w:val="Hyperlink"/>
-            <w:noProof/>
-            <w:lang w:val="vi-VN"/>
-          </w:rPr>
-          <w:t>Hình 3.2: Giao diện Trang chủ tổng quan Dashboard (DashboardPanel)</w:t>
-        </w:r>
-        <w:r>
-          <w:rPr>
-            <w:noProof/>
-            <w:webHidden/>
-          </w:rPr>
-          <w:tab/>
-        </w:r>
-        <w:r>
-          <w:rPr>
-            <w:noProof/>
-            <w:webHidden/>
-          </w:rPr>
-          <w:fldChar w:fldCharType="begin"/>
-        </w:r>
-        <w:r>
-          <w:rPr>
-            <w:noProof/>
-            <w:webHidden/>
-          </w:rPr>
-          <w:instrText xml:space="preserve"> PAGEREF _Toc239517681 \h </w:instrText>
-        </w:r>
-        <w:r>
-          <w:rPr>
-            <w:noProof/>
-            <w:webHidden/>
-          </w:rPr>
-        </w:r>
-        <w:r>
-          <w:rPr>
-            <w:noProof/>
-            <w:webHidden/>
-          </w:rPr>
-          <w:fldChar w:fldCharType="separate"/>
-        </w:r>
-        <w:r>
-          <w:rPr>
-            <w:noProof/>
-            <w:webHidden/>
-          </w:rPr>
-          <w:t>32</w:t>
-        </w:r>
-        <w:r>
-          <w:rPr>
-            <w:noProof/>
-            <w:webHidden/>
-          </w:rPr>
-          <w:fldChar w:fldCharType="end"/>
-        </w:r>
-      </w:hyperlink>
+      <w:r>
+        <w:t>Hình 3.2: Giao diện Trang chủ tổng quan Dashboard 6 thẻ KPI (DashboardPanel)</w:t>
+        <w:tab/>
+        <w:t>32</w:t>
+      </w:r>
     </w:p>
     <w:p>
       <w:pPr>
@@ -3119,64 +2909,11 @@
           <w14:ligatures w14:val="standardContextual"/>
         </w:rPr>
       </w:pPr>
-      <w:hyperlink w:anchor="_Toc239517682" w:history="1">
-        <w:r>
-          <w:rPr>
-            <w:rStyle w:val="Hyperlink"/>
-            <w:noProof/>
-            <w:lang w:val="vi-VN"/>
-          </w:rPr>
-          <w:t>Hình 3.3: Giao diện Lưới Thời Khóa Biểu Tuần trực quan (TimetableGridPanel)</w:t>
-        </w:r>
-        <w:r>
-          <w:rPr>
-            <w:noProof/>
-            <w:webHidden/>
-          </w:rPr>
-          <w:tab/>
-        </w:r>
-        <w:r>
-          <w:rPr>
-            <w:noProof/>
-            <w:webHidden/>
-          </w:rPr>
-          <w:fldChar w:fldCharType="begin"/>
-        </w:r>
-        <w:r>
-          <w:rPr>
-            <w:noProof/>
-            <w:webHidden/>
-          </w:rPr>
-          <w:instrText xml:space="preserve"> PAGEREF _Toc239517682 \h </w:instrText>
-        </w:r>
-        <w:r>
-          <w:rPr>
-            <w:noProof/>
-            <w:webHidden/>
-          </w:rPr>
-        </w:r>
-        <w:r>
-          <w:rPr>
-            <w:noProof/>
-            <w:webHidden/>
-          </w:rPr>
-          <w:fldChar w:fldCharType="separate"/>
-        </w:r>
-        <w:r>
-          <w:rPr>
-            <w:noProof/>
-            <w:webHidden/>
-          </w:rPr>
-          <w:t>32</w:t>
-        </w:r>
-        <w:r>
-          <w:rPr>
-            <w:noProof/>
-            <w:webHidden/>
-          </w:rPr>
-          <w:fldChar w:fldCharType="end"/>
-        </w:r>
-      </w:hyperlink>
+      <w:r>
+        <w:t>Hình 3.3: Giao diện Lưới Thời Khóa Biểu Ma trận đa chiều (TimetableGridPanel - Matrix View)</w:t>
+        <w:tab/>
+        <w:t>32</w:t>
+      </w:r>
     </w:p>
     <w:p>
       <w:pPr>
@@ -3193,64 +2930,11 @@
           <w14:ligatures w14:val="standardContextual"/>
         </w:rPr>
       </w:pPr>
-      <w:hyperlink w:anchor="_Toc239517683" w:history="1">
-        <w:r>
-          <w:rPr>
-            <w:rStyle w:val="Hyperlink"/>
-            <w:noProof/>
-            <w:lang w:val="vi-VN"/>
-          </w:rPr>
-          <w:t>Hình 3.4: Giao diện Quản lý Danh sách Thời Khóa Biểu (ThoiKhoaBieuPanel)</w:t>
-        </w:r>
-        <w:r>
-          <w:rPr>
-            <w:noProof/>
-            <w:webHidden/>
-          </w:rPr>
-          <w:tab/>
-        </w:r>
-        <w:r>
-          <w:rPr>
-            <w:noProof/>
-            <w:webHidden/>
-          </w:rPr>
-          <w:fldChar w:fldCharType="begin"/>
-        </w:r>
-        <w:r>
-          <w:rPr>
-            <w:noProof/>
-            <w:webHidden/>
-          </w:rPr>
-          <w:instrText xml:space="preserve"> PAGEREF _Toc239517683 \h </w:instrText>
-        </w:r>
-        <w:r>
-          <w:rPr>
-            <w:noProof/>
-            <w:webHidden/>
-          </w:rPr>
-        </w:r>
-        <w:r>
-          <w:rPr>
-            <w:noProof/>
-            <w:webHidden/>
-          </w:rPr>
-          <w:fldChar w:fldCharType="separate"/>
-        </w:r>
-        <w:r>
-          <w:rPr>
-            <w:noProof/>
-            <w:webHidden/>
-          </w:rPr>
-          <w:t>33</w:t>
-        </w:r>
-        <w:r>
-          <w:rPr>
-            <w:noProof/>
-            <w:webHidden/>
-          </w:rPr>
-          <w:fldChar w:fldCharType="end"/>
-        </w:r>
-      </w:hyperlink>
+      <w:r>
+        <w:t>Hình 3.4: Giao diện Quản lý Danh sách Thời Khóa Biểu &amp; Phân trang (ThoiKhoaBieuPanel)</w:t>
+        <w:tab/>
+        <w:t>33</w:t>
+      </w:r>
     </w:p>
     <w:p>
       <w:pPr>
@@ -3267,64 +2951,11 @@
           <w14:ligatures w14:val="standardContextual"/>
         </w:rPr>
       </w:pPr>
-      <w:hyperlink w:anchor="_Toc239517684" w:history="1">
-        <w:r>
-          <w:rPr>
-            <w:rStyle w:val="Hyperlink"/>
-            <w:noProof/>
-            <w:lang w:val="vi-VN"/>
-          </w:rPr>
-          <w:t>Hình 3.5: Hộp thoại Xếp lịch &amp; Báo lỗi Xung đột (XepLichDialog)</w:t>
-        </w:r>
-        <w:r>
-          <w:rPr>
-            <w:noProof/>
-            <w:webHidden/>
-          </w:rPr>
-          <w:tab/>
-        </w:r>
-        <w:r>
-          <w:rPr>
-            <w:noProof/>
-            <w:webHidden/>
-          </w:rPr>
-          <w:fldChar w:fldCharType="begin"/>
-        </w:r>
-        <w:r>
-          <w:rPr>
-            <w:noProof/>
-            <w:webHidden/>
-          </w:rPr>
-          <w:instrText xml:space="preserve"> PAGEREF _Toc239517684 \h </w:instrText>
-        </w:r>
-        <w:r>
-          <w:rPr>
-            <w:noProof/>
-            <w:webHidden/>
-          </w:rPr>
-        </w:r>
-        <w:r>
-          <w:rPr>
-            <w:noProof/>
-            <w:webHidden/>
-          </w:rPr>
-          <w:fldChar w:fldCharType="separate"/>
-        </w:r>
-        <w:r>
-          <w:rPr>
-            <w:noProof/>
-            <w:webHidden/>
-          </w:rPr>
-          <w:t>34</w:t>
-        </w:r>
-        <w:r>
-          <w:rPr>
-            <w:noProof/>
-            <w:webHidden/>
-          </w:rPr>
-          <w:fldChar w:fldCharType="end"/>
-        </w:r>
-      </w:hyperlink>
+      <w:r>
+        <w:t>Hình 3.5: Hộp thoại Xếp lịch mới &amp; Cảnh báo phát hiện Xung đột (XepLichDialog)</w:t>
+        <w:tab/>
+        <w:t>34</w:t>
+      </w:r>
     </w:p>
     <w:p>
       <w:pPr>
@@ -3341,64 +2972,11 @@
           <w14:ligatures w14:val="standardContextual"/>
         </w:rPr>
       </w:pPr>
-      <w:hyperlink w:anchor="_Toc239517685" w:history="1">
-        <w:r>
-          <w:rPr>
-            <w:rStyle w:val="Hyperlink"/>
-            <w:noProof/>
-            <w:lang w:val="vi-VN"/>
-          </w:rPr>
-          <w:t>Hình 3.7: Giao diện Quản lý Giảng viên (GiangVienPanel)</w:t>
-        </w:r>
-        <w:r>
-          <w:rPr>
-            <w:noProof/>
-            <w:webHidden/>
-          </w:rPr>
-          <w:tab/>
-        </w:r>
-        <w:r>
-          <w:rPr>
-            <w:noProof/>
-            <w:webHidden/>
-          </w:rPr>
-          <w:fldChar w:fldCharType="begin"/>
-        </w:r>
-        <w:r>
-          <w:rPr>
-            <w:noProof/>
-            <w:webHidden/>
-          </w:rPr>
-          <w:instrText xml:space="preserve"> PAGEREF _Toc239517685 \h </w:instrText>
-        </w:r>
-        <w:r>
-          <w:rPr>
-            <w:noProof/>
-            <w:webHidden/>
-          </w:rPr>
-        </w:r>
-        <w:r>
-          <w:rPr>
-            <w:noProof/>
-            <w:webHidden/>
-          </w:rPr>
-          <w:fldChar w:fldCharType="separate"/>
-        </w:r>
-        <w:r>
-          <w:rPr>
-            <w:noProof/>
-            <w:webHidden/>
-          </w:rPr>
-          <w:t>35</w:t>
-        </w:r>
-        <w:r>
-          <w:rPr>
-            <w:noProof/>
-            <w:webHidden/>
-          </w:rPr>
-          <w:fldChar w:fldCharType="end"/>
-        </w:r>
-      </w:hyperlink>
+      <w:r>
+        <w:t>Hình 3.6: Giao diện Quản lý Phòng học &amp; Tài nguyên (PhongHocPanel)</w:t>
+        <w:tab/>
+        <w:t>34</w:t>
+      </w:r>
     </w:p>
     <w:p>
       <w:pPr>
@@ -3415,64 +2993,11 @@
           <w14:ligatures w14:val="standardContextual"/>
         </w:rPr>
       </w:pPr>
-      <w:hyperlink w:anchor="_Toc239517686" w:history="1">
-        <w:r>
-          <w:rPr>
-            <w:rStyle w:val="Hyperlink"/>
-            <w:noProof/>
-            <w:lang w:val="vi-VN"/>
-          </w:rPr>
-          <w:t>Hình 3.8: Giao diện Quản lý Môn học (MonHocPanel)</w:t>
-        </w:r>
-        <w:r>
-          <w:rPr>
-            <w:noProof/>
-            <w:webHidden/>
-          </w:rPr>
-          <w:tab/>
-        </w:r>
-        <w:r>
-          <w:rPr>
-            <w:noProof/>
-            <w:webHidden/>
-          </w:rPr>
-          <w:fldChar w:fldCharType="begin"/>
-        </w:r>
-        <w:r>
-          <w:rPr>
-            <w:noProof/>
-            <w:webHidden/>
-          </w:rPr>
-          <w:instrText xml:space="preserve"> PAGEREF _Toc239517686 \h </w:instrText>
-        </w:r>
-        <w:r>
-          <w:rPr>
-            <w:noProof/>
-            <w:webHidden/>
-          </w:rPr>
-        </w:r>
-        <w:r>
-          <w:rPr>
-            <w:noProof/>
-            <w:webHidden/>
-          </w:rPr>
-          <w:fldChar w:fldCharType="separate"/>
-        </w:r>
-        <w:r>
-          <w:rPr>
-            <w:noProof/>
-            <w:webHidden/>
-          </w:rPr>
-          <w:t>36</w:t>
-        </w:r>
-        <w:r>
-          <w:rPr>
-            <w:noProof/>
-            <w:webHidden/>
-          </w:rPr>
-          <w:fldChar w:fldCharType="end"/>
-        </w:r>
-      </w:hyperlink>
+      <w:r>
+        <w:t>Hình 3.7: Giao diện Quản lý Giảng viên (GiangVienPanel)</w:t>
+        <w:tab/>
+        <w:t>35</w:t>
+      </w:r>
     </w:p>
     <w:p>
       <w:pPr>
@@ -3489,64 +3014,11 @@
           <w14:ligatures w14:val="standardContextual"/>
         </w:rPr>
       </w:pPr>
-      <w:hyperlink w:anchor="_Toc239517687" w:history="1">
-        <w:r>
-          <w:rPr>
-            <w:rStyle w:val="Hyperlink"/>
-            <w:noProof/>
-            <w:lang w:val="vi-VN"/>
-          </w:rPr>
-          <w:t>Hình 3.9: Giao diện Quản lý Lớp học (LopHocPanel)</w:t>
-        </w:r>
-        <w:r>
-          <w:rPr>
-            <w:noProof/>
-            <w:webHidden/>
-          </w:rPr>
-          <w:tab/>
-        </w:r>
-        <w:r>
-          <w:rPr>
-            <w:noProof/>
-            <w:webHidden/>
-          </w:rPr>
-          <w:fldChar w:fldCharType="begin"/>
-        </w:r>
-        <w:r>
-          <w:rPr>
-            <w:noProof/>
-            <w:webHidden/>
-          </w:rPr>
-          <w:instrText xml:space="preserve"> PAGEREF _Toc239517687 \h </w:instrText>
-        </w:r>
-        <w:r>
-          <w:rPr>
-            <w:noProof/>
-            <w:webHidden/>
-          </w:rPr>
-        </w:r>
-        <w:r>
-          <w:rPr>
-            <w:noProof/>
-            <w:webHidden/>
-          </w:rPr>
-          <w:fldChar w:fldCharType="separate"/>
-        </w:r>
-        <w:r>
-          <w:rPr>
-            <w:noProof/>
-            <w:webHidden/>
-          </w:rPr>
-          <w:t>36</w:t>
-        </w:r>
-        <w:r>
-          <w:rPr>
-            <w:noProof/>
-            <w:webHidden/>
-          </w:rPr>
-          <w:fldChar w:fldCharType="end"/>
-        </w:r>
-      </w:hyperlink>
+      <w:r>
+        <w:t>Hình 3.8: Giao diện Quản lý Môn học chuẩn khung CTĐT (MonHocPanel)</w:t>
+        <w:tab/>
+        <w:t>36</w:t>
+      </w:r>
     </w:p>
     <w:p>
       <w:pPr>
@@ -3563,64 +3035,11 @@
           <w14:ligatures w14:val="standardContextual"/>
         </w:rPr>
       </w:pPr>
-      <w:hyperlink w:anchor="_Toc239517688" w:history="1">
-        <w:r>
-          <w:rPr>
-            <w:rStyle w:val="Hyperlink"/>
-            <w:noProof/>
-            <w:lang w:val="vi-VN"/>
-          </w:rPr>
-          <w:t>Hình 3.10: Giao diện Thống kê Hiệu suất &amp; Tra cứu Phòng trống (ThongKePanel)</w:t>
-        </w:r>
-        <w:r>
-          <w:rPr>
-            <w:noProof/>
-            <w:webHidden/>
-          </w:rPr>
-          <w:tab/>
-        </w:r>
-        <w:r>
-          <w:rPr>
-            <w:noProof/>
-            <w:webHidden/>
-          </w:rPr>
-          <w:fldChar w:fldCharType="begin"/>
-        </w:r>
-        <w:r>
-          <w:rPr>
-            <w:noProof/>
-            <w:webHidden/>
-          </w:rPr>
-          <w:instrText xml:space="preserve"> PAGEREF _Toc239517688 \h </w:instrText>
-        </w:r>
-        <w:r>
-          <w:rPr>
-            <w:noProof/>
-            <w:webHidden/>
-          </w:rPr>
-        </w:r>
-        <w:r>
-          <w:rPr>
-            <w:noProof/>
-            <w:webHidden/>
-          </w:rPr>
-          <w:fldChar w:fldCharType="separate"/>
-        </w:r>
-        <w:r>
-          <w:rPr>
-            <w:noProof/>
-            <w:webHidden/>
-          </w:rPr>
-          <w:t>37</w:t>
-        </w:r>
-        <w:r>
-          <w:rPr>
-            <w:noProof/>
-            <w:webHidden/>
-          </w:rPr>
-          <w:fldChar w:fldCharType="end"/>
-        </w:r>
-      </w:hyperlink>
+      <w:r>
+        <w:t>Hình 3.9: Giao diện Quản lý Lớp học sinh viên (LopHocPanel)</w:t>
+        <w:tab/>
+        <w:t>36</w:t>
+      </w:r>
     </w:p>
     <w:p>
       <w:pPr>
@@ -3637,71 +3056,20 @@
           <w14:ligatures w14:val="standardContextual"/>
         </w:rPr>
       </w:pPr>
-      <w:hyperlink w:anchor="_Toc239517689" w:history="1">
-        <w:r>
-          <w:rPr>
-            <w:rStyle w:val="Hyperlink"/>
-            <w:noProof/>
-            <w:lang w:val="vi-VN"/>
-          </w:rPr>
-          <w:t>Hình 3.11: Giao diện Quản trị Tài khoản người dùng (TaiKhoanPanel)</w:t>
-        </w:r>
-        <w:r>
-          <w:rPr>
-            <w:noProof/>
-            <w:webHidden/>
-          </w:rPr>
-          <w:tab/>
-        </w:r>
-        <w:r>
-          <w:rPr>
-            <w:noProof/>
-            <w:webHidden/>
-          </w:rPr>
-          <w:fldChar w:fldCharType="begin"/>
-        </w:r>
-        <w:r>
-          <w:rPr>
-            <w:noProof/>
-            <w:webHidden/>
-          </w:rPr>
-          <w:instrText xml:space="preserve"> PAGEREF _Toc239517689 \h </w:instrText>
-        </w:r>
-        <w:r>
-          <w:rPr>
-            <w:noProof/>
-            <w:webHidden/>
-          </w:rPr>
-        </w:r>
-        <w:r>
-          <w:rPr>
-            <w:noProof/>
-            <w:webHidden/>
-          </w:rPr>
-          <w:fldChar w:fldCharType="separate"/>
-        </w:r>
-        <w:r>
-          <w:rPr>
-            <w:noProof/>
-            <w:webHidden/>
-          </w:rPr>
-          <w:t>38</w:t>
-        </w:r>
-        <w:r>
-          <w:rPr>
-            <w:noProof/>
-            <w:webHidden/>
-          </w:rPr>
-          <w:fldChar w:fldCharType="end"/>
-        </w:r>
-      </w:hyperlink>
+      <w:r>
+        <w:t>Hình 3.10: Giao diện Thống kê Giờ dạy &amp; Tải đào tạo Giảng viên (ThongKePanel)</w:t>
+        <w:tab/>
+        <w:t>37</w:t>
+      </w:r>
     </w:p>
     <w:p>
       <w:pPr>
         <w:spacing w:before="0" w:after="160" w:line="259" w:lineRule="auto"/>
       </w:pPr>
       <w:r>
-        <w:fldChar w:fldCharType="end"/>
+        <w:t>Hình 3.11: Giao diện Quản trị Tài khoản người dùng &amp; Phân quyền 6 vai trò (TaiKhoanPanel)</w:t>
+        <w:tab/>
+        <w:t>38</w:t>
       </w:r>
     </w:p>
     <w:p>
@@ -3709,7 +3077,58 @@
         <w:spacing w:before="0" w:after="160" w:line="259" w:lineRule="auto"/>
       </w:pPr>
       <w:r>
-        <w:br w:type="page"/>
+        <w:t>Hình 3.12: Giao diện Lưới Thời Khóa Biểu dạng Khối trực quan (Block View)</w:t>
+        <w:tab/>
+        <w:t>39</w:t>
+      </w:r>
+    </w:p>
+    <w:p>
+      <w:r>
+        <w:t>Hình 3.19: Cơ chế Đăng nhập nhanh và phân quyền 6 vai trò người dùng (RBAC)</w:t>
+        <w:tab/>
+        <w:t>45</w:t>
+      </w:r>
+    </w:p>
+    <w:p>
+      <w:r>
+        <w:t>Hình 3.18: Giao diện Thống kê Phân bổ Sinh viên theo Niên khóa và Lớp học</w:t>
+        <w:tab/>
+        <w:t>44</w:t>
+      </w:r>
+    </w:p>
+    <w:p>
+      <w:r>
+        <w:t>Hình 3.17: Giao diện Nhật ký Kiểm toán Hoạt động &amp; Bảo mật Hệ thống (AuditLogPanel)</w:t>
+        <w:tab/>
+        <w:t>43</w:t>
+      </w:r>
+    </w:p>
+    <w:p>
+      <w:r>
+        <w:t>Hình 3.16: Giao diện Quản lý Sinh viên tích hợp Thanh Phân trang chuẩn hóa (PaginationBar)</w:t>
+        <w:tab/>
+        <w:t>42</w:t>
+      </w:r>
+    </w:p>
+    <w:p>
+      <w:r>
+        <w:t>Hình 3.15: Giao diện Quản lý Khung Chương trình đào tạo 130 tín chỉ 4 năm (CurriculumPanel)</w:t>
+        <w:tab/>
+        <w:t>41</w:t>
+      </w:r>
+    </w:p>
+    <w:p>
+      <w:r>
+        <w:t>Hình 3.14: Giao diện Giảng viên Đề xuất Đổi lịch dạy và Theo dõi trạng thái đơn</w:t>
+        <w:tab/>
+        <w:t>40</w:t>
+      </w:r>
+    </w:p>
+    <w:p>
+      <w:r>
+        <w:t>Hình 3.13: Giao diện Thời Khóa Biểu Giảng Dạy Cá Nhân của Giảng Viên</w:t>
+        <w:tab/>
+        <w:t>39</w:t>
       </w:r>
     </w:p>
     <w:p>
@@ -3739,72 +3158,10 @@
         </w:rPr>
       </w:pPr>
       <w:r>
-        <w:fldChar w:fldCharType="begin"/>
-      </w:r>
-      <w:r>
-        <w:instrText xml:space="preserve"> TOC \h \z \t "Bảng,1" </w:instrText>
-      </w:r>
-      <w:r>
-        <w:fldChar w:fldCharType="separate"/>
-      </w:r>
-      <w:hyperlink w:anchor="_Toc239517690" w:history="1">
-        <w:r>
-          <w:rPr>
-            <w:rStyle w:val="Hyperlink"/>
-            <w:noProof/>
-            <w:lang w:val="vi-VN"/>
-          </w:rPr>
-          <w:t>Bảng 2.1: Mô tả màn hình Đăng nhập (LoginForm)</w:t>
-        </w:r>
-        <w:r>
-          <w:rPr>
-            <w:noProof/>
-            <w:webHidden/>
-          </w:rPr>
-          <w:tab/>
-        </w:r>
-        <w:r>
-          <w:rPr>
-            <w:noProof/>
-            <w:webHidden/>
-          </w:rPr>
-          <w:fldChar w:fldCharType="begin"/>
-        </w:r>
-        <w:r>
-          <w:rPr>
-            <w:noProof/>
-            <w:webHidden/>
-          </w:rPr>
-          <w:instrText xml:space="preserve"> PAGEREF _Toc239517690 \h </w:instrText>
-        </w:r>
-        <w:r>
-          <w:rPr>
-            <w:noProof/>
-            <w:webHidden/>
-          </w:rPr>
-        </w:r>
-        <w:r>
-          <w:rPr>
-            <w:noProof/>
-            <w:webHidden/>
-          </w:rPr>
-          <w:fldChar w:fldCharType="separate"/>
-        </w:r>
-        <w:r>
-          <w:rPr>
-            <w:noProof/>
-            <w:webHidden/>
-          </w:rPr>
-          <w:t>10</w:t>
-        </w:r>
-        <w:r>
-          <w:rPr>
-            <w:noProof/>
-            <w:webHidden/>
-          </w:rPr>
-          <w:fldChar w:fldCharType="end"/>
-        </w:r>
-      </w:hyperlink>
+        <w:t>Bảng 1.1: Bảng phân công nhiệm vụ thực hiện đề tài (Nhóm 2 thành viên)</w:t>
+        <w:tab/>
+        <w:t>5</w:t>
+      </w:r>
     </w:p>
     <w:p>
       <w:pPr>
@@ -3821,64 +3178,11 @@
           <w14:ligatures w14:val="standardContextual"/>
         </w:rPr>
       </w:pPr>
-      <w:hyperlink w:anchor="_Toc239517691" w:history="1">
-        <w:r>
-          <w:rPr>
-            <w:rStyle w:val="Hyperlink"/>
-            <w:noProof/>
-            <w:lang w:val="vi-VN"/>
-          </w:rPr>
-          <w:t>Bảng 2.2: Mô tả màn hình Chính (MainForm)</w:t>
-        </w:r>
-        <w:r>
-          <w:rPr>
-            <w:noProof/>
-            <w:webHidden/>
-          </w:rPr>
-          <w:tab/>
-        </w:r>
-        <w:r>
-          <w:rPr>
-            <w:noProof/>
-            <w:webHidden/>
-          </w:rPr>
-          <w:fldChar w:fldCharType="begin"/>
-        </w:r>
-        <w:r>
-          <w:rPr>
-            <w:noProof/>
-            <w:webHidden/>
-          </w:rPr>
-          <w:instrText xml:space="preserve"> PAGEREF _Toc239517691 \h </w:instrText>
-        </w:r>
-        <w:r>
-          <w:rPr>
-            <w:noProof/>
-            <w:webHidden/>
-          </w:rPr>
-        </w:r>
-        <w:r>
-          <w:rPr>
-            <w:noProof/>
-            <w:webHidden/>
-          </w:rPr>
-          <w:fldChar w:fldCharType="separate"/>
-        </w:r>
-        <w:r>
-          <w:rPr>
-            <w:noProof/>
-            <w:webHidden/>
-          </w:rPr>
-          <w:t>10</w:t>
-        </w:r>
-        <w:r>
-          <w:rPr>
-            <w:noProof/>
-            <w:webHidden/>
-          </w:rPr>
-          <w:fldChar w:fldCharType="end"/>
-        </w:r>
-      </w:hyperlink>
+      <w:r>
+        <w:t>Bảng 1.2: Ma trận tiến độ phối hợp triển khai 10 tuần</w:t>
+        <w:tab/>
+        <w:t>6</w:t>
+      </w:r>
     </w:p>
     <w:p>
       <w:pPr>
@@ -3895,64 +3199,11 @@
           <w14:ligatures w14:val="standardContextual"/>
         </w:rPr>
       </w:pPr>
-      <w:hyperlink w:anchor="_Toc239517692" w:history="1">
-        <w:r>
-          <w:rPr>
-            <w:rStyle w:val="Hyperlink"/>
-            <w:noProof/>
-            <w:lang w:val="vi-VN"/>
-          </w:rPr>
-          <w:t>Bảng 2.3: Mô tả màn hình Lưới Thời Khóa Biểu (TimetableGridPanel)</w:t>
-        </w:r>
-        <w:r>
-          <w:rPr>
-            <w:noProof/>
-            <w:webHidden/>
-          </w:rPr>
-          <w:tab/>
-        </w:r>
-        <w:r>
-          <w:rPr>
-            <w:noProof/>
-            <w:webHidden/>
-          </w:rPr>
-          <w:fldChar w:fldCharType="begin"/>
-        </w:r>
-        <w:r>
-          <w:rPr>
-            <w:noProof/>
-            <w:webHidden/>
-          </w:rPr>
-          <w:instrText xml:space="preserve"> PAGEREF _Toc239517692 \h </w:instrText>
-        </w:r>
-        <w:r>
-          <w:rPr>
-            <w:noProof/>
-            <w:webHidden/>
-          </w:rPr>
-        </w:r>
-        <w:r>
-          <w:rPr>
-            <w:noProof/>
-            <w:webHidden/>
-          </w:rPr>
-          <w:fldChar w:fldCharType="separate"/>
-        </w:r>
-        <w:r>
-          <w:rPr>
-            <w:noProof/>
-            <w:webHidden/>
-          </w:rPr>
-          <w:t>11</w:t>
-        </w:r>
-        <w:r>
-          <w:rPr>
-            <w:noProof/>
-            <w:webHidden/>
-          </w:rPr>
-          <w:fldChar w:fldCharType="end"/>
-        </w:r>
-      </w:hyperlink>
+      <w:r>
+        <w:t>Bảng 2.1: Bảng ma trận phân quyền 6 vai trò người dùng (RBAC Matrix)</w:t>
+        <w:tab/>
+        <w:t>9</w:t>
+      </w:r>
     </w:p>
     <w:p>
       <w:pPr>
@@ -3969,64 +3220,11 @@
           <w14:ligatures w14:val="standardContextual"/>
         </w:rPr>
       </w:pPr>
-      <w:hyperlink w:anchor="_Toc239517693" w:history="1">
-        <w:r>
-          <w:rPr>
-            <w:rStyle w:val="Hyperlink"/>
-            <w:noProof/>
-            <w:lang w:val="vi-VN"/>
-          </w:rPr>
-          <w:t>Bảng 2.4: Mô tả màn hình Xếp lịch TKB (ThoiKhoaBieuPanel &amp; XepLichDialog)</w:t>
-        </w:r>
-        <w:r>
-          <w:rPr>
-            <w:noProof/>
-            <w:webHidden/>
-          </w:rPr>
-          <w:tab/>
-        </w:r>
-        <w:r>
-          <w:rPr>
-            <w:noProof/>
-            <w:webHidden/>
-          </w:rPr>
-          <w:fldChar w:fldCharType="begin"/>
-        </w:r>
-        <w:r>
-          <w:rPr>
-            <w:noProof/>
-            <w:webHidden/>
-          </w:rPr>
-          <w:instrText xml:space="preserve"> PAGEREF _Toc239517693 \h </w:instrText>
-        </w:r>
-        <w:r>
-          <w:rPr>
-            <w:noProof/>
-            <w:webHidden/>
-          </w:rPr>
-        </w:r>
-        <w:r>
-          <w:rPr>
-            <w:noProof/>
-            <w:webHidden/>
-          </w:rPr>
-          <w:fldChar w:fldCharType="separate"/>
-        </w:r>
-        <w:r>
-          <w:rPr>
-            <w:noProof/>
-            <w:webHidden/>
-          </w:rPr>
-          <w:t>12</w:t>
-        </w:r>
-        <w:r>
-          <w:rPr>
-            <w:noProof/>
-            <w:webHidden/>
-          </w:rPr>
-          <w:fldChar w:fldCharType="end"/>
-        </w:r>
-      </w:hyperlink>
+      <w:r>
+        <w:t>Bảng 2.2: Mô tả màn hình Đăng nhập (LoginForm)</w:t>
+        <w:tab/>
+        <w:t>10</w:t>
+      </w:r>
     </w:p>
     <w:p>
       <w:pPr>
@@ -4043,71 +3241,20 @@
           <w14:ligatures w14:val="standardContextual"/>
         </w:rPr>
       </w:pPr>
-      <w:hyperlink w:anchor="_Toc239517694" w:history="1">
-        <w:r>
-          <w:rPr>
-            <w:rStyle w:val="Hyperlink"/>
-            <w:noProof/>
-            <w:lang w:val="vi-VN"/>
-          </w:rPr>
-          <w:t>Bảng 2.5: Mô tả màn hình Thống kê &amp; Tra cứu phòng trống (ThongKePanel)</w:t>
-        </w:r>
-        <w:r>
-          <w:rPr>
-            <w:noProof/>
-            <w:webHidden/>
-          </w:rPr>
-          <w:tab/>
-        </w:r>
-        <w:r>
-          <w:rPr>
-            <w:noProof/>
-            <w:webHidden/>
-          </w:rPr>
-          <w:fldChar w:fldCharType="begin"/>
-        </w:r>
-        <w:r>
-          <w:rPr>
-            <w:noProof/>
-            <w:webHidden/>
-          </w:rPr>
-          <w:instrText xml:space="preserve"> PAGEREF _Toc239517694 \h </w:instrText>
-        </w:r>
-        <w:r>
-          <w:rPr>
-            <w:noProof/>
-            <w:webHidden/>
-          </w:rPr>
-        </w:r>
-        <w:r>
-          <w:rPr>
-            <w:noProof/>
-            <w:webHidden/>
-          </w:rPr>
-          <w:fldChar w:fldCharType="separate"/>
-        </w:r>
-        <w:r>
-          <w:rPr>
-            <w:noProof/>
-            <w:webHidden/>
-          </w:rPr>
-          <w:t>14</w:t>
-        </w:r>
-        <w:r>
-          <w:rPr>
-            <w:noProof/>
-            <w:webHidden/>
-          </w:rPr>
-          <w:fldChar w:fldCharType="end"/>
-        </w:r>
-      </w:hyperlink>
+      <w:r>
+        <w:t>Bảng 2.3: Mô tả màn hình Trang chủ Dashboard (DashboardPanel)</w:t>
+        <w:tab/>
+        <w:t>10</w:t>
+      </w:r>
     </w:p>
     <w:p>
       <w:pPr>
         <w:spacing w:before="0" w:after="160" w:line="259" w:lineRule="auto"/>
       </w:pPr>
       <w:r>
-        <w:fldChar w:fldCharType="end"/>
+        <w:t>Bảng 2.4: Mô tả màn hình Lưới Thời Khóa Biểu (TimetableGridPanel)</w:t>
+        <w:tab/>
+        <w:t>11</w:t>
       </w:r>
     </w:p>
     <w:p>
@@ -4115,7 +3262,9 @@
         <w:spacing w:before="0" w:after="160" w:line="259" w:lineRule="auto"/>
       </w:pPr>
       <w:r>
-        <w:br w:type="page"/>
+        <w:t>Bảng 2.5: Mô tả màn hình Xếp lịch TKB (ThoiKhoaBieuPanel &amp; XepLichDialog)</w:t>
+        <w:tab/>
+        <w:t>12</w:t>
       </w:r>
     </w:p>
     <w:p>
@@ -4131,6 +3280,53 @@
           <w:docGrid w:linePitch="360"/>
         </w:sectPr>
       </w:pPr>
+      <w:r>
+        <w:t>Bảng 2.6: Mô tả màn hình Đề xuất &amp; Phê duyệt đổi lịch 2 cấp (DeXuatDoiLichPanel &amp; DoiLichPanel)</w:t>
+        <w:tab/>
+        <w:t>13</w:t>
+      </w:r>
+    </w:p>
+    <w:p>
+      <w:r>
+        <w:t>Bảng 3.1: Bảng kịch bản và kết quả kiểm thử hệ thống (Test Cases Result)</w:t>
+        <w:tab/>
+        <w:t>48</w:t>
+      </w:r>
+    </w:p>
+    <w:p>
+      <w:r>
+        <w:t>Bảng 2.11: Bảng mô tả chi tiết vai trò từng file mã nguồn trong dự án</w:t>
+        <w:tab/>
+        <w:t>25</w:t>
+      </w:r>
+    </w:p>
+    <w:p>
+      <w:r>
+        <w:t>Bảng 2.10: Mô tả màn hình Thống kê &amp; Tra cứu phòng trống (ThongKePanel)</w:t>
+        <w:tab/>
+        <w:t>15</w:t>
+      </w:r>
+    </w:p>
+    <w:p>
+      <w:r>
+        <w:t>Bảng 2.9: Mô tả màn hình Nhật ký Kiểm toán hệ thống (AuditLogPanel)</w:t>
+        <w:tab/>
+        <w:t>14</w:t>
+      </w:r>
+    </w:p>
+    <w:p>
+      <w:r>
+        <w:t>Bảng 2.8: Mô tả màn hình Quản lý Sinh viên &amp; Phân trang (SinhVienPanel &amp; PaginationBar)</w:t>
+        <w:tab/>
+        <w:t>14</w:t>
+      </w:r>
+    </w:p>
+    <w:p>
+      <w:r>
+        <w:t>Bảng 2.7: Mô tả màn hình Khung Chương trình đào tạo 130 tín chỉ (CurriculumPanel)</w:t>
+        <w:tab/>
+        <w:t>13</w:t>
+      </w:r>
     </w:p>
     <w:p>
       <w:pPr>
@@ -10012,12 +9208,19 @@
         </w:rPr>
       </w:pPr>
       <w:r>
-        <w:rPr>
-          <w:sz w:val="26"/>
-          <w:szCs w:val="26"/>
-          <w:lang w:val="vi-VN"/>
-        </w:rPr>
-        <w:t>Quản trị viên (ADMIN): Có toàn quyền trong hệ thống. Quản lý danh mục cơ sở (Phòng, Giảng viên, Môn học, Lớp), xếp và chỉnh sửa thời khóa biểu, thống kê báo cáo, quản trị tài khoản và phân quyền người dùng.</w:t>
+        <w:t>Hệ thống Quản lý Thời khóa biểu và Tài nguyên Phòng học (CNJ56) được thiết kế phục vụ 6 nhóm tác nhân chính với phân quyền chặt chẽ:</w:t>
+        <w:br/>
+        <w:t>1. Quản trị viên (ADMIN): Quản lý toàn diện tài khoản người dùng, phân cấp quyền hạn, đặt lại mật khẩu, theo dõi giám sát toàn bộ Nhật ký kiểm toán hệ thống (Audit Log).</w:t>
+        <w:br/>
+        <w:t>2. Ban Giám Hiệu (BAN_GIAM_HIEU): Xem Dashboard tổng quan, tra cứu TKB toàn trường, thống kê hiệu suất sử dụng tài nguyên, phê duyệt cấp 2 đối với các đơn xin đổi lịch dạy của giảng viên.</w:t>
+        <w:br/>
+        <w:t>3. Cán bộ Phòng Đào Tạo (PHONG_DAO_TAO): Lập lịch thời khóa biểu, quản lý danh mục phòng học, điều phối tài nguyên, xử lý xung đột lịch học, phê duyệt đổi lịch và xuất báo cáo.</w:t>
+        <w:br/>
+        <w:t>4. Trưởng Khoa / Trưởng Bộ Môn (TRUONG_KHOA): Quản lý hồ sơ giảng viên, danh mục môn học thuộc khoa, thẩm định và phê duyệt sơ bộ (cấp 1) các đơn đề xuất đổi lịch dạy.</w:t>
+        <w:br/>
+        <w:t>5. Giảng viên (GIANG_VIEN): Tra cứu thời khóa biểu giảng dạy cá nhân, tạo phiếu đề xuất xin đổi lịch dạy khi có việc đột xuất và theo dõi tiến độ phê duyệt của Khoa và Đào tạo.</w:t>
+        <w:br/>
+        <w:t>6. Sinh viên (SINH_VIEN): Tra cứu thời khóa biểu lớp học theo tuần, xem khung chương trình đào tạo chuẩn 130 tín chỉ 4 năm và tiến độ học tập cá nhân.</w:t>
       </w:r>
     </w:p>
     <w:p>
@@ -10113,12 +9316,46 @@
       <w:pPr>
         <w:pStyle w:val="BodyText"/>
         <w:spacing w:line="360" w:lineRule="auto"/>
-        <w:jc w:val="both"/>
+        <w:jc w:val="center"/>
         <w:rPr>
           <w:sz w:val="26"/>
           <w:szCs w:val="26"/>
         </w:rPr>
       </w:pPr>
+      <w:r>
+        <w:drawing>
+          <wp:inline xmlns:a="http://schemas.openxmlformats.org/drawingml/2006/main" xmlns:pic="http://schemas.openxmlformats.org/drawingml/2006/picture">
+            <wp:extent cx="5669280" cy="4251960"/>
+            <wp:docPr id="1564385760" name="Picture 1564385760"/>
+            <wp:cNvGraphicFramePr>
+              <a:graphicFrameLocks noChangeAspect="1"/>
+            </wp:cNvGraphicFramePr>
+            <a:graphic>
+              <a:graphicData uri="http://schemas.openxmlformats.org/drawingml/2006/picture">
+                <pic:pic>
+                  <pic:nvPicPr>
+                    <pic:cNvPr id="0" name="image.png"/>
+                    <pic:cNvPicPr/>
+                  </pic:nvPicPr>
+                  <pic:blipFill>
+                    <a:blip r:embed="rId10"/>
+                    <a:stretch>
+                      <a:fillRect/>
+                    </a:stretch>
+                  </pic:blipFill>
+                  <pic:spPr>
+                    <a:xfrm>
+                      <a:off x="0" y="0"/>
+                      <a:ext cx="5669280" cy="4251960"/>
+                    </a:xfrm>
+                    <a:prstGeom prst="rect"/>
+                  </pic:spPr>
+                </pic:pic>
+              </a:graphicData>
+            </a:graphic>
+          </wp:inline>
+        </w:drawing>
+      </w:r>
     </w:p>
     <w:p>
       <w:pPr>
@@ -23792,14 +23029,9 @@
           <w:lang w:val="vi-VN"/>
         </w:rPr>
       </w:pPr>
-      <w:bookmarkStart w:id="29" w:name="_Toc239517680"/>
-      <w:r>
-        <w:rPr>
-          <w:lang w:val="vi-VN"/>
-        </w:rPr>
-        <w:t>Hình 3.1: Giao diện Đăng nhập hệ thống (LoginForm)</w:t>
-      </w:r>
-      <w:bookmarkEnd w:id="29"/>
+      <w:r>
+        <w:t>Hình 3.1: Giao diện Đăng nhập hệ thống &amp; Quick Login 6 vai trò (LoginForm)</w:t>
+      </w:r>
     </w:p>
     <w:p>
       <w:pPr>
@@ -23814,12 +23046,7 @@
         </w:rPr>
       </w:pPr>
       <w:r>
-        <w:rPr>
-          <w:sz w:val="26"/>
-          <w:szCs w:val="26"/>
-          <w:lang w:val="vi-VN"/>
-        </w:rPr>
-        <w:t>Mô tả: Tiếp nhận tên đăng nhập và mật khẩu, kiểm tra trạng thái hoạt động của tài khoản trong CSDL và điều hướng người dùng vào giao diện chính tương ứng với quyền hạn.</w:t>
+        <w:t>Mô tả: Tiếp nhận tên đăng nhập và mật khẩu, kiểm tra trạng thái hoạt động của tài khoản trong CSDL qua AuthService (SHA-256). Tích hợp các nút chọn vai trò nhanh (Quick Login) hỗ trợ hội đồng nghiệm thu kiểm tra nhanh 6 vai trò phân quyền.</w:t>
       </w:r>
     </w:p>
     <w:p>
@@ -23918,15 +23145,9 @@
           <w:lang w:val="vi-VN"/>
         </w:rPr>
       </w:pPr>
-      <w:bookmarkStart w:id="30" w:name="_Toc239517681"/>
-      <w:r>
-        <w:rPr>
-          <w:szCs w:val="26"/>
-          <w:lang w:val="vi-VN"/>
-        </w:rPr>
-        <w:t>Hình 3.2: Giao diện Trang chủ tổng quan Dashboard (DashboardPanel)</w:t>
-      </w:r>
-      <w:bookmarkEnd w:id="30"/>
+      <w:r>
+        <w:t>Hình 3.2: Giao diện Trang chủ tổng quan Dashboard 6 thẻ KPI (DashboardPanel)</w:t>
+      </w:r>
     </w:p>
     <w:p>
       <w:pPr>
@@ -23941,12 +23162,7 @@
         </w:rPr>
       </w:pPr>
       <w:r>
-        <w:rPr>
-          <w:sz w:val="26"/>
-          <w:szCs w:val="26"/>
-          <w:lang w:val="vi-VN"/>
-        </w:rPr>
-        <w:t>Mô tả: Hiển thị 5 thẻ thống kê số lượng phòng học, giảng viên, môn học, lớp học, lịch đã xếp và các nút truy cập nhanh vào các phân hệ chính.</w:t>
+        <w:t>Mô tả: Hiển thị 6 thẻ thống kê KPI tổng quan (Phòng học, Giảng viên, Sinh viên, Môn học, Lịch xếp tuần, Yêu cầu chờ duyệt), biểu đồ phân bổ trạng thái và khối thông tin hệ thống chuyên nghiệp đặt gọn gàng ở phía dưới.</w:t>
       </w:r>
     </w:p>
     <w:p>
@@ -24026,14 +23242,9 @@
           <w:lang w:val="vi-VN"/>
         </w:rPr>
       </w:pPr>
-      <w:bookmarkStart w:id="31" w:name="_Toc239517682"/>
-      <w:r>
-        <w:rPr>
-          <w:lang w:val="vi-VN"/>
-        </w:rPr>
-        <w:t>Hình 3.3: Giao diện Lưới Thời Khóa Biểu Tuần trực quan (TimetableGridPanel)</w:t>
-      </w:r>
-      <w:bookmarkEnd w:id="31"/>
+      <w:r>
+        <w:t>Hình 3.3: Giao diện Lưới Thời Khóa Biểu Ma trận đa chiều (TimetableGridPanel - Matrix View)</w:t>
+      </w:r>
     </w:p>
     <w:p>
       <w:pPr>
@@ -24048,40 +23259,7 @@
         </w:rPr>
       </w:pPr>
       <w:r>
-        <w:rPr>
-          <w:sz w:val="26"/>
-          <w:szCs w:val="26"/>
-          <w:lang w:val="vi-VN"/>
-        </w:rPr>
-        <w:t>Mô tả: Trực quan hóa thời khóa biểu theo ma trận 12 tiết học </w:t>
-      </w:r>
-      <m:oMath>
-        <m:r>
-          <w:rPr>
-            <w:rFonts w:ascii="Cambria Math" w:hAnsi="Cambria Math"/>
-            <w:sz w:val="26"/>
-            <w:szCs w:val="26"/>
-            <w:lang w:val="vi-VN"/>
-          </w:rPr>
-          <m:t>×</m:t>
-        </m:r>
-      </m:oMath>
-      <w:r>
-        <w:rPr>
-          <w:sz w:val="26"/>
-          <w:szCs w:val="26"/>
-          <w:lang w:val="vi-VN"/>
-        </w:rPr>
-        <w:t xml:space="preserve"> 7 ngày trong tuần. </w:t>
-      </w:r>
-      <w:r>
-        <w:rPr>
-          <w:sz w:val="26"/>
-          <w:szCs w:val="26"/>
-          <w:lang w:val="vi-VN"/>
-        </w:rPr>
-        <w:lastRenderedPageBreak/>
-        <w:t>Hỗ trợ lọc xem theo Lớp học, theo Phòng học, theo Giảng viên hoặc Toàn trường; nhấp đúp vào ô để xem chi tiết.</w:t>
+        <w:t>Mô tả: Trực quan hóa thời khóa biểu theo ma trận 12 tiết học x 7 ngày trong tuần. Hỗ trợ lọc xem theo Lớp học, theo Phòng học, theo Giảng viên hoặc Toàn trường; nhấp đúp vào ô để xem chi tiết ca học.</w:t>
       </w:r>
     </w:p>
     <w:p>
@@ -24161,14 +23339,9 @@
           <w:lang w:val="vi-VN"/>
         </w:rPr>
       </w:pPr>
-      <w:bookmarkStart w:id="32" w:name="_Toc239517683"/>
-      <w:r>
-        <w:rPr>
-          <w:lang w:val="vi-VN"/>
-        </w:rPr>
-        <w:t>Hình 3.4: Giao diện Quản lý Danh sách Thời Khóa Biểu (ThoiKhoaBieuPanel)</w:t>
-      </w:r>
-      <w:bookmarkEnd w:id="32"/>
+      <w:r>
+        <w:t>Hình 3.4: Giao diện Quản lý Danh sách Thời Khóa Biểu &amp; Phân trang (ThoiKhoaBieuPanel)</w:t>
+      </w:r>
     </w:p>
     <w:p>
       <w:pPr>
@@ -24183,12 +23356,7 @@
         </w:rPr>
       </w:pPr>
       <w:r>
-        <w:rPr>
-          <w:sz w:val="26"/>
-          <w:szCs w:val="26"/>
-          <w:lang w:val="vi-VN"/>
-        </w:rPr>
-        <w:t>Mô tả: Danh sách bảng dữ liệu đầy đủ các lịch học với 2 hàng bộ lọc đa tiêu chí (Kỳ, Năm, Tuần, Thứ, Phòng, GV, Lớp), nút Xuất Excel và các nút Thêm/Sửa/Xóa.</w:t>
+        <w:t>Mô tả: Danh sách bảng dữ liệu đầy đủ các lịch học với 2 hàng bộ lọc đa tiêu chí (Kỳ, Năm, Tuần, Thứ, Phòng, GV, Lớp), nút Xuất Excel/CSV và thanh phân trang PaginationBar điều hướng linh hoạt.</w:t>
       </w:r>
     </w:p>
     <w:p>
@@ -24630,14 +23798,9 @@
           <w:lang w:val="vi-VN"/>
         </w:rPr>
       </w:pPr>
-      <w:bookmarkStart w:id="35" w:name="_Toc239517686"/>
-      <w:r>
-        <w:rPr>
-          <w:lang w:val="vi-VN"/>
-        </w:rPr>
-        <w:t>Hình 3.8: Giao diện Quản lý Môn học (MonHocPanel)</w:t>
-      </w:r>
-      <w:bookmarkEnd w:id="35"/>
+      <w:r>
+        <w:t>Hình 3.8: Giao diện Quản lý Môn học chuẩn khung CTĐT (MonHocPanel)</w:t>
+      </w:r>
     </w:p>
     <w:p>
       <w:pPr>
@@ -24736,14 +23899,9 @@
           <w:lang w:val="vi-VN"/>
         </w:rPr>
       </w:pPr>
-      <w:bookmarkStart w:id="36" w:name="_Toc239517687"/>
-      <w:r>
-        <w:rPr>
-          <w:lang w:val="vi-VN"/>
-        </w:rPr>
-        <w:t>Hình 3.9: Giao diện Quản lý Lớp học (LopHocPanel)</w:t>
-      </w:r>
-      <w:bookmarkEnd w:id="36"/>
+      <w:r>
+        <w:t>Hình 3.9: Giao diện Quản lý Lớp học sinh viên (LopHocPanel)</w:t>
+      </w:r>
     </w:p>
     <w:p>
       <w:pPr>
@@ -24843,14 +24001,9 @@
           <w:lang w:val="vi-VN"/>
         </w:rPr>
       </w:pPr>
-      <w:bookmarkStart w:id="37" w:name="_Toc239517688"/>
-      <w:r>
-        <w:rPr>
-          <w:lang w:val="vi-VN"/>
-        </w:rPr>
-        <w:t>Hình 3.10: Giao diện Thống kê Hiệu suất &amp; Tra cứu Phòng trống (ThongKePanel)</w:t>
-      </w:r>
-      <w:bookmarkEnd w:id="37"/>
+      <w:r>
+        <w:t>Hình 3.10: Giao diện Thống kê Giờ dạy &amp; Tải đào tạo Giảng viên (ThongKePanel - Giảng viên)</w:t>
+      </w:r>
     </w:p>
     <w:p>
       <w:pPr>
@@ -24865,12 +24018,7 @@
         </w:rPr>
       </w:pPr>
       <w:r>
-        <w:rPr>
-          <w:sz w:val="26"/>
-          <w:szCs w:val="26"/>
-          <w:lang w:val="vi-VN"/>
-        </w:rPr>
-        <w:t>Mô tả: Đo lường tỷ lệ sử dụng từng phòng học (%) và công cụ tìm kiếm phòng học còn trống theo khung giờ cụ thể để xếp lịch nhanh.</w:t>
+        <w:t>Mô tả: Báo cáo đo lường chi tiết tổng số giờ dạy, số tiết học và tải giảng dạy của từng giảng viên theo tuần và học kỳ, hỗ trợ phòng Đào tạo cân đối khối lượng công việc.</w:t>
       </w:r>
     </w:p>
     <w:p>
@@ -24965,14 +24113,9 @@
       <w:pPr>
         <w:pStyle w:val="Hnh"/>
       </w:pPr>
-      <w:bookmarkStart w:id="38" w:name="_Toc239517689"/>
-      <w:r>
-        <w:rPr>
-          <w:lang w:val="vi-VN"/>
-        </w:rPr>
-        <w:t>Hình 3.11: Giao diện Quản trị Tài khoản người dùng (TaiKhoanPanel)</w:t>
-      </w:r>
-      <w:bookmarkEnd w:id="38"/>
+      <w:r>
+        <w:t>Hình 3.11: Giao diện Quản trị Tài khoản người dùng &amp; Phân quyền 6 vai trò RBAC (TaiKhoanPanel)</w:t>
+      </w:r>
     </w:p>
     <w:p>
       <w:pPr>
@@ -24985,12 +24128,542 @@
         </w:rPr>
       </w:pPr>
       <w:r>
-        <w:rPr>
+        <w:t>Mô tả: Phân hệ dành riêng cho ADMIN: quản lý tài khoản người dùng, cấp phát và thay đổi 6 vai trò RBAC (Admin, Ban Giám Hiệu, Phòng Đào Tạo, Trưởng Khoa, Giảng Viên, Sinh Viên), đặt lại mật khẩu và bật/tắt trạng thái khóa tài khoản.</w:t>
+      </w:r>
+    </w:p>
+    <w:p>
+      <w:r>
+        <w:rPr>
+          <w:b/>
           <w:sz w:val="26"/>
-          <w:szCs w:val="26"/>
-          <w:lang w:val="vi-VN"/>
-        </w:rPr>
-        <w:t>Mô tả: Phân hệ dành riêng cho ADMIN: thêm tài khoản mới, đổi mật khẩu băm và bật/tắt trạng thái khóa tài khoản người dùng.</w:t>
+        </w:rPr>
+        <w:t>12. Màn hình Lưới Thời Khóa Biểu Dạng Khối (Block View) &amp; TKB Giảng Viên</w:t>
+      </w:r>
+    </w:p>
+    <w:p>
+      <w:pPr>
+        <w:jc w:val="center"/>
+      </w:pPr>
+      <w:r>
+        <w:drawing>
+          <wp:inline xmlns:a="http://schemas.openxmlformats.org/drawingml/2006/main" xmlns:pic="http://schemas.openxmlformats.org/drawingml/2006/picture">
+            <wp:extent cx="5303520" cy="3196355"/>
+            <wp:docPr id="1564385761" name="Picture 1564385761"/>
+            <wp:cNvGraphicFramePr>
+              <a:graphicFrameLocks noChangeAspect="1"/>
+            </wp:cNvGraphicFramePr>
+            <a:graphic>
+              <a:graphicData uri="http://schemas.openxmlformats.org/drawingml/2006/picture">
+                <pic:pic>
+                  <pic:nvPicPr>
+                    <pic:cNvPr id="0" name="hinh_grid_block_schedule.png"/>
+                    <pic:cNvPicPr/>
+                  </pic:nvPicPr>
+                  <pic:blipFill>
+                    <a:blip r:embed="rId33"/>
+                    <a:stretch>
+                      <a:fillRect/>
+                    </a:stretch>
+                  </pic:blipFill>
+                  <pic:spPr>
+                    <a:xfrm>
+                      <a:off x="0" y="0"/>
+                      <a:ext cx="5303520" cy="3196355"/>
+                    </a:xfrm>
+                    <a:prstGeom prst="rect"/>
+                  </pic:spPr>
+                </pic:pic>
+              </a:graphicData>
+            </a:graphic>
+          </wp:inline>
+        </w:drawing>
+      </w:r>
+    </w:p>
+    <w:p>
+      <w:pPr>
+        <w:jc w:val="center"/>
+      </w:pPr>
+      <w:r>
+        <w:rPr>
+          <w:i/>
+          <w:sz w:val="21"/>
+        </w:rPr>
+        <w:t>Hình 3.12: Giao diện Lưới Thời Khóa Biểu dạng Khối trực quan (Block View)</w:t>
+      </w:r>
+    </w:p>
+    <w:p>
+      <w:r>
+        <w:rPr>
+          <w:sz w:val="22"/>
+        </w:rPr>
+        <w:t>Mô tả: Chế độ hiển thị dạng Khối (Block View) trực quan hóa các ca học theo từng khối thời gian sáng và chiều, giúp giảng viên và người quản lý dễ dàng nhận biết các khoảng trống phòng học và thời gian biểu trong tuần.</w:t>
+      </w:r>
+    </w:p>
+    <w:p>
+      <w:pPr>
+        <w:jc w:val="center"/>
+      </w:pPr>
+      <w:r>
+        <w:drawing>
+          <wp:inline xmlns:a="http://schemas.openxmlformats.org/drawingml/2006/main" xmlns:pic="http://schemas.openxmlformats.org/drawingml/2006/picture">
+            <wp:extent cx="5303520" cy="3314700"/>
+            <wp:docPr id="1564385762" name="Picture 1564385762"/>
+            <wp:cNvGraphicFramePr>
+              <a:graphicFrameLocks noChangeAspect="1"/>
+            </wp:cNvGraphicFramePr>
+            <a:graphic>
+              <a:graphicData uri="http://schemas.openxmlformats.org/drawingml/2006/picture">
+                <pic:pic>
+                  <pic:nvPicPr>
+                    <pic:cNvPr id="0" name="hinh_tkb_giangvien.png"/>
+                    <pic:cNvPicPr/>
+                  </pic:nvPicPr>
+                  <pic:blipFill>
+                    <a:blip r:embed="rId34"/>
+                    <a:stretch>
+                      <a:fillRect/>
+                    </a:stretch>
+                  </pic:blipFill>
+                  <pic:spPr>
+                    <a:xfrm>
+                      <a:off x="0" y="0"/>
+                      <a:ext cx="5303520" cy="3314700"/>
+                    </a:xfrm>
+                    <a:prstGeom prst="rect"/>
+                  </pic:spPr>
+                </pic:pic>
+              </a:graphicData>
+            </a:graphic>
+          </wp:inline>
+        </w:drawing>
+      </w:r>
+    </w:p>
+    <w:p>
+      <w:pPr>
+        <w:jc w:val="center"/>
+      </w:pPr>
+      <w:r>
+        <w:rPr>
+          <w:i/>
+          <w:sz w:val="21"/>
+        </w:rPr>
+        <w:t>Hình 3.13: Giao diện Thời Khóa Biểu Giảng Dạy Cá Nhân của Giảng Viên</w:t>
+      </w:r>
+    </w:p>
+    <w:p>
+      <w:r>
+        <w:rPr>
+          <w:sz w:val="22"/>
+        </w:rPr>
+        <w:t>Mô tả: Phân hệ cho phép giảng viên tra cứu lịch giảng dạy cá nhân trong từng học kỳ và tuần học cụ thể, hiển thị đầy đủ thông tin môn học, lớp sinh viên, phòng học và thời gian bắt đầu - kết thúc.</w:t>
+      </w:r>
+    </w:p>
+    <w:p>
+      <w:r>
+        <w:rPr>
+          <w:b/>
+          <w:sz w:val="26"/>
+        </w:rPr>
+        <w:t>13. Phân hệ Đề Xuất &amp; Phê Duyệt Đổi Lịch 2 Cấp Độ</w:t>
+      </w:r>
+    </w:p>
+    <w:p>
+      <w:pPr>
+        <w:jc w:val="center"/>
+      </w:pPr>
+      <w:r>
+        <w:drawing>
+          <wp:inline xmlns:a="http://schemas.openxmlformats.org/drawingml/2006/main" xmlns:pic="http://schemas.openxmlformats.org/drawingml/2006/picture">
+            <wp:extent cx="5303520" cy="3196355"/>
+            <wp:docPr id="1564385763" name="Picture 1564385763"/>
+            <wp:cNvGraphicFramePr>
+              <a:graphicFrameLocks noChangeAspect="1"/>
+            </wp:cNvGraphicFramePr>
+            <a:graphic>
+              <a:graphicData uri="http://schemas.openxmlformats.org/drawingml/2006/picture">
+                <pic:pic>
+                  <pic:nvPicPr>
+                    <pic:cNvPr id="0" name="hinh_dexuat_doilich.png"/>
+                    <pic:cNvPicPr/>
+                  </pic:nvPicPr>
+                  <pic:blipFill>
+                    <a:blip r:embed="rId35"/>
+                    <a:stretch>
+                      <a:fillRect/>
+                    </a:stretch>
+                  </pic:blipFill>
+                  <pic:spPr>
+                    <a:xfrm>
+                      <a:off x="0" y="0"/>
+                      <a:ext cx="5303520" cy="3196355"/>
+                    </a:xfrm>
+                    <a:prstGeom prst="rect"/>
+                  </pic:spPr>
+                </pic:pic>
+              </a:graphicData>
+            </a:graphic>
+          </wp:inline>
+        </w:drawing>
+      </w:r>
+    </w:p>
+    <w:p>
+      <w:pPr>
+        <w:jc w:val="center"/>
+      </w:pPr>
+      <w:r>
+        <w:rPr>
+          <w:i/>
+          <w:sz w:val="21"/>
+        </w:rPr>
+        <w:t>Hình 3.14: Giao diện Giảng viên Đề xuất Đổi lịch dạy và Theo dõi trạng thái đơn</w:t>
+      </w:r>
+    </w:p>
+    <w:p>
+      <w:r>
+        <w:rPr>
+          <w:sz w:val="22"/>
+        </w:rPr>
+        <w:t>Mô tả: Giảng viên gửi đơn đề xuất đổi lịch dạy (chọn phòng mới, thứ mới, tiết mới). Hệ thống gọi XepLichService kiểm tra xung đột tức thời trước khi lưu đơn. Đơn chuyển qua quy trình duyệt 2 cấp: Trưởng Khoa duyệt cấp 1 -&gt; Phòng Đào tạo / Ban Giám Hiệu duyệt chốt cấp 2 và tự động cập nhật TKB.</w:t>
+      </w:r>
+    </w:p>
+    <w:p>
+      <w:r>
+        <w:rPr>
+          <w:b/>
+          <w:sz w:val="26"/>
+        </w:rPr>
+        <w:t>14. Phân hệ Quản Lý Khung Chương Trình Đào Tạo 130 Tín Chỉ (CurriculumPanel)</w:t>
+      </w:r>
+    </w:p>
+    <w:p>
+      <w:pPr>
+        <w:jc w:val="center"/>
+      </w:pPr>
+      <w:r>
+        <w:drawing>
+          <wp:inline xmlns:a="http://schemas.openxmlformats.org/drawingml/2006/main" xmlns:pic="http://schemas.openxmlformats.org/drawingml/2006/picture">
+            <wp:extent cx="5303520" cy="3314700"/>
+            <wp:docPr id="1564385764" name="Picture 1564385764"/>
+            <wp:cNvGraphicFramePr>
+              <a:graphicFrameLocks noChangeAspect="1"/>
+            </wp:cNvGraphicFramePr>
+            <a:graphic>
+              <a:graphicData uri="http://schemas.openxmlformats.org/drawingml/2006/picture">
+                <pic:pic>
+                  <pic:nvPicPr>
+                    <pic:cNvPr id="0" name="hinh_ctdt_k24_130tc.png"/>
+                    <pic:cNvPicPr/>
+                  </pic:nvPicPr>
+                  <pic:blipFill>
+                    <a:blip r:embed="rId36"/>
+                    <a:stretch>
+                      <a:fillRect/>
+                    </a:stretch>
+                  </pic:blipFill>
+                  <pic:spPr>
+                    <a:xfrm>
+                      <a:off x="0" y="0"/>
+                      <a:ext cx="5303520" cy="3314700"/>
+                    </a:xfrm>
+                    <a:prstGeom prst="rect"/>
+                  </pic:spPr>
+                </pic:pic>
+              </a:graphicData>
+            </a:graphic>
+          </wp:inline>
+        </w:drawing>
+      </w:r>
+    </w:p>
+    <w:p>
+      <w:pPr>
+        <w:jc w:val="center"/>
+      </w:pPr>
+      <w:r>
+        <w:rPr>
+          <w:i/>
+          <w:sz w:val="21"/>
+        </w:rPr>
+        <w:t>Hình 3.15: Giao diện Quản lý Khung Chương trình đào tạo 130 tín chỉ 4 năm (CurriculumPanel)</w:t>
+      </w:r>
+    </w:p>
+    <w:p>
+      <w:r>
+        <w:rPr>
+          <w:sz w:val="22"/>
+        </w:rPr>
+        <w:t>Mô tả: Quản lý chi tiết toàn bộ 42 môn học với tổng cộng 130 tín chỉ phân bổ chuẩn hóa qua 8 học kỳ (4 năm học). Hỗ trợ lọc theo từng khóa sinh viên (K21, K22, K23, K24, K25) và tính toán tổng số tín chỉ tích lũy.</w:t>
+      </w:r>
+    </w:p>
+    <w:p>
+      <w:r>
+        <w:rPr>
+          <w:b/>
+          <w:sz w:val="26"/>
+        </w:rPr>
+        <w:t>15. Phân hệ Quản Lý Sinh Viên &amp; Thanh Phân Trang Chuẩn Hóa (SinhVienPanel &amp; PaginationBar)</w:t>
+      </w:r>
+    </w:p>
+    <w:p>
+      <w:pPr>
+        <w:jc w:val="center"/>
+      </w:pPr>
+      <w:r>
+        <w:drawing>
+          <wp:inline xmlns:a="http://schemas.openxmlformats.org/drawingml/2006/main" xmlns:pic="http://schemas.openxmlformats.org/drawingml/2006/picture">
+            <wp:extent cx="5303520" cy="3196355"/>
+            <wp:docPr id="1564385765" name="Picture 1564385765"/>
+            <wp:cNvGraphicFramePr>
+              <a:graphicFrameLocks noChangeAspect="1"/>
+            </wp:cNvGraphicFramePr>
+            <a:graphic>
+              <a:graphicData uri="http://schemas.openxmlformats.org/drawingml/2006/picture">
+                <pic:pic>
+                  <pic:nvPicPr>
+                    <pic:cNvPr id="0" name="hinh_sinhvien_pagination.png"/>
+                    <pic:cNvPicPr/>
+                  </pic:nvPicPr>
+                  <pic:blipFill>
+                    <a:blip r:embed="rId37"/>
+                    <a:stretch>
+                      <a:fillRect/>
+                    </a:stretch>
+                  </pic:blipFill>
+                  <pic:spPr>
+                    <a:xfrm>
+                      <a:off x="0" y="0"/>
+                      <a:ext cx="5303520" cy="3196355"/>
+                    </a:xfrm>
+                    <a:prstGeom prst="rect"/>
+                  </pic:spPr>
+                </pic:pic>
+              </a:graphicData>
+            </a:graphic>
+          </wp:inline>
+        </w:drawing>
+      </w:r>
+    </w:p>
+    <w:p>
+      <w:pPr>
+        <w:jc w:val="center"/>
+      </w:pPr>
+      <w:r>
+        <w:rPr>
+          <w:i/>
+          <w:sz w:val="21"/>
+        </w:rPr>
+        <w:t>Hình 3.16: Giao diện Quản lý Sinh viên tích hợp Thanh Phân trang chuẩn hóa (PaginationBar)</w:t>
+      </w:r>
+    </w:p>
+    <w:p>
+      <w:r>
+        <w:rPr>
+          <w:sz w:val="22"/>
+        </w:rPr>
+        <w:t>Mô tả: Quản lý danh mục 2.000 sinh viên chia theo các lớp và niên khóa. Tích hợp thanh phân trang PaginationBar (20 sinh viên/trang) với các nút Đầu, Trước, danh sách số trang, Sau, Cuối cùng chỉ báo Trang hiện tại / Tổng số trang và Tổng số bản ghi.</w:t>
+      </w:r>
+    </w:p>
+    <w:p>
+      <w:r>
+        <w:rPr>
+          <w:b/>
+          <w:sz w:val="26"/>
+        </w:rPr>
+        <w:t>16. Phân hệ Nhật Ký Kiểm Toán An Ninh Hệ Thống (AuditLogPanel)</w:t>
+      </w:r>
+    </w:p>
+    <w:p>
+      <w:pPr>
+        <w:jc w:val="center"/>
+      </w:pPr>
+      <w:r>
+        <w:drawing>
+          <wp:inline xmlns:a="http://schemas.openxmlformats.org/drawingml/2006/main" xmlns:pic="http://schemas.openxmlformats.org/drawingml/2006/picture">
+            <wp:extent cx="5303520" cy="3196355"/>
+            <wp:docPr id="1564385766" name="Picture 1564385766"/>
+            <wp:cNvGraphicFramePr>
+              <a:graphicFrameLocks noChangeAspect="1"/>
+            </wp:cNvGraphicFramePr>
+            <a:graphic>
+              <a:graphicData uri="http://schemas.openxmlformats.org/drawingml/2006/picture">
+                <pic:pic>
+                  <pic:nvPicPr>
+                    <pic:cNvPr id="0" name="hinh_audit_log.png"/>
+                    <pic:cNvPicPr/>
+                  </pic:nvPicPr>
+                  <pic:blipFill>
+                    <a:blip r:embed="rId38"/>
+                    <a:stretch>
+                      <a:fillRect/>
+                    </a:stretch>
+                  </pic:blipFill>
+                  <pic:spPr>
+                    <a:xfrm>
+                      <a:off x="0" y="0"/>
+                      <a:ext cx="5303520" cy="3196355"/>
+                    </a:xfrm>
+                    <a:prstGeom prst="rect"/>
+                  </pic:spPr>
+                </pic:pic>
+              </a:graphicData>
+            </a:graphic>
+          </wp:inline>
+        </w:drawing>
+      </w:r>
+    </w:p>
+    <w:p>
+      <w:pPr>
+        <w:jc w:val="center"/>
+      </w:pPr>
+      <w:r>
+        <w:rPr>
+          <w:i/>
+          <w:sz w:val="21"/>
+        </w:rPr>
+        <w:t>Hình 3.17: Giao diện Nhật ký Kiểm toán Hoạt động &amp; Bảo mật Hệ thống (AuditLogPanel)</w:t>
+      </w:r>
+    </w:p>
+    <w:p>
+      <w:r>
+        <w:rPr>
+          <w:sz w:val="22"/>
+        </w:rPr>
+        <w:t>Mô tả: Giám sát toàn bộ hoạt động trong hệ thống. Ghi nhận chi tiết: Mã người dùng, Tên đăng nhập, Hành động (Đăng nhập, Xếp lịch, Đổi phòng, Sửa điểm...), Đối tượng tác động, Dữ liệu cũ -&gt; Dữ liệu mới, Địa chỉ IP và Dấu thời gian chính xác tới từng giây.</w:t>
+      </w:r>
+    </w:p>
+    <w:p>
+      <w:r>
+        <w:rPr>
+          <w:b/>
+          <w:sz w:val="26"/>
+        </w:rPr>
+        <w:t>17. Phân hệ Thống Kê Phân Bổ Sinh Viên Theo Niên Khóa &amp; Lớp Học</w:t>
+      </w:r>
+    </w:p>
+    <w:p>
+      <w:pPr>
+        <w:jc w:val="center"/>
+      </w:pPr>
+      <w:r>
+        <w:drawing>
+          <wp:inline xmlns:a="http://schemas.openxmlformats.org/drawingml/2006/main" xmlns:pic="http://schemas.openxmlformats.org/drawingml/2006/picture">
+            <wp:extent cx="5303520" cy="3236046"/>
+            <wp:docPr id="1564385767" name="Picture 1564385767"/>
+            <wp:cNvGraphicFramePr>
+              <a:graphicFrameLocks noChangeAspect="1"/>
+            </wp:cNvGraphicFramePr>
+            <a:graphic>
+              <a:graphicData uri="http://schemas.openxmlformats.org/drawingml/2006/picture">
+                <pic:pic>
+                  <pic:nvPicPr>
+                    <pic:cNvPr id="0" name="hinh_thongke_sinhvien.png"/>
+                    <pic:cNvPicPr/>
+                  </pic:nvPicPr>
+                  <pic:blipFill>
+                    <a:blip r:embed="rId39"/>
+                    <a:stretch>
+                      <a:fillRect/>
+                    </a:stretch>
+                  </pic:blipFill>
+                  <pic:spPr>
+                    <a:xfrm>
+                      <a:off x="0" y="0"/>
+                      <a:ext cx="5303520" cy="3236046"/>
+                    </a:xfrm>
+                    <a:prstGeom prst="rect"/>
+                  </pic:spPr>
+                </pic:pic>
+              </a:graphicData>
+            </a:graphic>
+          </wp:inline>
+        </w:drawing>
+      </w:r>
+    </w:p>
+    <w:p>
+      <w:pPr>
+        <w:jc w:val="center"/>
+      </w:pPr>
+      <w:r>
+        <w:rPr>
+          <w:i/>
+          <w:sz w:val="21"/>
+        </w:rPr>
+        <w:t>Hình 3.18: Giao diện Thống kê Phân bổ Sinh viên theo Niên khóa và Lớp học</w:t>
+      </w:r>
+    </w:p>
+    <w:p>
+      <w:r>
+        <w:rPr>
+          <w:sz w:val="22"/>
+        </w:rPr>
+        <w:t>Mô tả: Thống kê số lượng sinh viên theo từng khóa học (K21 - K25) và từng lớp chuyên ngành, tính toán tỷ lệ phân bổ phần trăm giúp nhà trường có cái nhìn tổng quan về quy mô đào tạo từng niên khóa.</w:t>
+      </w:r>
+    </w:p>
+    <w:p>
+      <w:r>
+        <w:rPr>
+          <w:b/>
+          <w:sz w:val="26"/>
+        </w:rPr>
+        <w:t>18. Phân hệ Phân Quyền Đa Cấp RBAC 6 Vai Trò &amp; Chuyển Đổi Nhanh</w:t>
+      </w:r>
+    </w:p>
+    <w:p>
+      <w:pPr>
+        <w:jc w:val="center"/>
+      </w:pPr>
+      <w:r>
+        <w:drawing>
+          <wp:inline xmlns:a="http://schemas.openxmlformats.org/drawingml/2006/main" xmlns:pic="http://schemas.openxmlformats.org/drawingml/2006/picture">
+            <wp:extent cx="5303520" cy="5534108"/>
+            <wp:docPr id="1564385768" name="Picture 1564385768"/>
+            <wp:cNvGraphicFramePr>
+              <a:graphicFrameLocks noChangeAspect="1"/>
+            </wp:cNvGraphicFramePr>
+            <a:graphic>
+              <a:graphicData uri="http://schemas.openxmlformats.org/drawingml/2006/picture">
+                <pic:pic>
+                  <pic:nvPicPr>
+                    <pic:cNvPr id="0" name="image.png"/>
+                    <pic:cNvPicPr/>
+                  </pic:nvPicPr>
+                  <pic:blipFill>
+                    <a:blip r:embed="rId14"/>
+                    <a:stretch>
+                      <a:fillRect/>
+                    </a:stretch>
+                  </pic:blipFill>
+                  <pic:spPr>
+                    <a:xfrm>
+                      <a:off x="0" y="0"/>
+                      <a:ext cx="5303520" cy="5534108"/>
+                    </a:xfrm>
+                    <a:prstGeom prst="rect"/>
+                  </pic:spPr>
+                </pic:pic>
+              </a:graphicData>
+            </a:graphic>
+          </wp:inline>
+        </w:drawing>
+      </w:r>
+    </w:p>
+    <w:p>
+      <w:pPr>
+        <w:jc w:val="center"/>
+      </w:pPr>
+      <w:r>
+        <w:rPr>
+          <w:i/>
+          <w:sz w:val="21"/>
+        </w:rPr>
+        <w:t>Hình 3.19: Cơ chế Đăng nhập nhanh và phân quyền 6 vai trò người dùng (RBAC)</w:t>
+      </w:r>
+    </w:p>
+    <w:p>
+      <w:r>
+        <w:rPr>
+          <w:sz w:val="22"/>
+        </w:rPr>
+        <w:t>Mô tả: Hệ thống thiết lập ma trận phân quyền 6 vai trò người dùng chuyên biệt: ADMIN, BAN_GIAM_HIEU, PHONG_DAO_TAO, TRUONG_KHOA, GIANG_VIEN, SINH_VIEN. Menu điều hướng bên trái (Sidebar) tự động ẩn/hiện đúng phạm vi quyền hạn của từng vai trò.</w:t>
       </w:r>
     </w:p>
     <w:p>

</xml_diff>

<commit_message>
Cap nhat kien truc he thong phan tang: Bo sung tang Tac nhan (6 vai tro RBAC) tren Draw.io va Word
</commit_message>
<xml_diff>
--- a/BTL_CN_Java.docx
+++ b/BTL_CN_Java.docx
@@ -2805,7 +2805,7 @@
         </w:rPr>
       </w:pPr>
       <w:r>
-        <w:t>Hình 2.2 Sơ đồ kiến trúc hệ thống phân tầng tích hợp Nhật ký hệ thống (Audit Log)</w:t>
+        <w:t>Hình 2.2: Sơ đồ kiến trúc hệ thống phân tầng tích hợp Tác nhân người dùng và Audit Log [Thiết kế trên Draw.io]</w:t>
         <w:tab/>
         <w:t>9</w:t>
       </w:r>
@@ -9400,6 +9400,8 @@
       <w:r>
         <w:t>2.2.1. Phân tích chi tiết các tầng kiến trúc:</w:t>
         <w:br/>
+        <w:t>0. Tầng Tác nhân người dùng (Actors / Roles - 6 vai trò RBAC): Điểm khởi đầu của mọi tương tác vào hệ thống, bao gồm 6 nhóm tác nhân được định danh và phân quyền ma trận nghiêm ngặt: Quản Trị Viên (Admin - quản trị hệ thống &amp; audit log), Ban Giám Hiệu (giám sát KPI, duyệt cấp 2), Phòng Đào Tạo (lập TKB, duyệt đổi lịch cấp 2), Trưởng Khoa / Bộ Môn (quản lý GV, duyệt cấp 1), Giảng Viên (xem lịch dạy, xin đổi lịch), Sinh Viên (xem TKB lớp, xem CTĐT 130 tín chỉ).</w:t>
+        <w:br/>
         <w:t>1. Tầng Trình diễn (Presentation Layer - Java Swing &amp; Flat UI): Chịu trách nhiệm tương tác người dùng. Giao diện được xây dựng trên nền tảng Java Swing hiện đại với bộ nút bấm FlatButton tự vẽ khử răng cưa. Bao gồm LoginForm, MainForm (điều hành chính qua CardLayout), TimetableGridPanel (ma trận 12 tiết x 7 ngày, tích hợp tính năng UX tương tác: giữ phím Shift + cuộn chuột MouseWheel để zoom in / zoom out mượt mà), ThoiKhoaBieuPanel (lọc đa chiều), ScheduleSwapPanel (giao diện xin và duyệt đổi lịch), NhatKyPanel (tra cứu và xuất báo cáo kiểm toán), PhongHocPanel, GiangVienPanel, MonHocPanel, LopHocPanel, ThongKePanel, TaiKhoanPanel (chỉ dành riêng Admin), và DatabaseToolPanel (thao tác DDL cấu trúc bảng và reset seed data trực tiếp từ ứng dụng).</w:t>
         <w:br/>
         <w:t>2. Tầng Điều hướng &amp; Tiếp nhận (Controller Layer): Đóng vai trò cầu nối trung gian (Request Dispatcher), tiếp nhận sự kiện từ các Panel/Dialog, trích xuất dữ liệu form, kiểm tra hợp lệ sơ bộ và ủy quyền xử lý cho Tầng Service: AuthController, ScheduleController, ScheduleSwapController, AuditLogController, AccountController, CurriculumController, DatabaseToolController.</w:t>
@@ -9536,7 +9538,7 @@
       <w:r>
         <w:drawing>
           <wp:inline xmlns:a="http://schemas.openxmlformats.org/drawingml/2006/main" xmlns:pic="http://schemas.openxmlformats.org/drawingml/2006/picture">
-            <wp:extent cx="5943600" cy="4152900"/>
+            <wp:extent cx="5400000" cy="6660000"/>
             <wp:docPr id="1564385759" name="Picture 1564385759"/>
             <wp:cNvGraphicFramePr>
               <a:graphicFrameLocks noChangeAspect="1"/>
@@ -9557,7 +9559,7 @@
                   <pic:spPr>
                     <a:xfrm>
                       <a:off x="0" y="0"/>
-                      <a:ext cx="5943600" cy="4152900"/>
+                      <a:ext cx="5400000" cy="6660000"/>
                     </a:xfrm>
                     <a:prstGeom prst="rect"/>
                   </pic:spPr>
@@ -9574,7 +9576,7 @@
         <w:jc w:val="center"/>
       </w:pPr>
       <w:r>
-        <w:t>Hình 2.2: Sơ đồ kiến trúc hệ thống phân tầng tích hợp Nhật ký hệ thống (Audit Log) [Thiết kế trên Draw.io]</w:t>
+        <w:t>Hình 2.2: Sơ đồ kiến trúc hệ thống phân tầng tích hợp Tác nhân người dùng và Audit Log [Thiết kế trên Draw.io]</w:t>
       </w:r>
     </w:p>
     <w:p>

</xml_diff>